<commit_message>
Update LAMF knowledge base and session-scoped chat storage.
Align product answers with current launch rules (LTV, balloon-only 12-month tenure, risk-based pricing, processing fees, no foreclosure charges, minimum MF holding, no additional pledge) via supplements and ingest patches. Add per-user Firestore/local chat isolation, remove the Firebase fallback banner, and tighten stocks or pledge guardrails in Gemini responses.

Co-authored-by: Cursor <cursoragent@cursor.com>
</commit_message>
<xml_diff>
--- a/SCCL_LAMF_Program_Document_V3.0 1.docx
+++ b/SCCL_LAMF_Program_Document_V3.0 1.docx
@@ -8056,7 +8056,7 @@
                 <w:sz w:val="22"/>
                 <w:szCs w:val="22"/>
               </w:rPr>
-              <w:t>Dynamic pricing in range 9.5%–</w:t>
+              <w:t>Risk-based pricing in range 9.5%–</w:t>
             </w:r>
             <w:r>
               <w:rPr>
@@ -9506,7 +9506,7 @@
           <w:sz w:val="16"/>
           <w:szCs w:val="16"/>
         </w:rPr>
-        <w:t>* Dynamic pricing Processing fee</w:t>
+        <w:t>* Risk-based pricing Processing fee</w:t>
       </w:r>
     </w:p>
     <w:p>
@@ -9584,7 +9584,7 @@
           <w:sz w:val="22"/>
           <w:szCs w:val="22"/>
         </w:rPr>
-        <w:t xml:space="preserve"> dynamic pricing model for LAMF. </w:t>
+        <w:t xml:space="preserve"> risk-based pricing model for LAMF. </w:t>
       </w:r>
       <w:r>
         <w:rPr>
@@ -9592,7 +9592,7 @@
           <w:sz w:val="22"/>
           <w:szCs w:val="22"/>
         </w:rPr>
-        <w:t>Under the dynamic model, the applicable interest rate will f</w:t>
+        <w:t>Under risk-based pricing, the applicable interest rate will f</w:t>
       </w:r>
       <w:r>
         <w:rPr>
@@ -12332,7 +12332,7 @@
                 <w:sz w:val="22"/>
                 <w:szCs w:val="22"/>
               </w:rPr>
-              <w:t>Bureau score will be considered for Dynamic pricing</w:t>
+              <w:t>Bureau score will be considered for Risk-based pricing</w:t>
             </w:r>
             <w:r>
               <w:rPr>
@@ -12348,7 +12348,7 @@
                 <w:sz w:val="22"/>
                 <w:szCs w:val="22"/>
               </w:rPr>
-              <w:t>– Refer Dynamic pricing policy document</w:t>
+              <w:t>– Refer Risk-based pricing policy document</w:t>
             </w:r>
           </w:p>
         </w:tc>
@@ -15671,23 +15671,23 @@
                 <w:sz w:val="22"/>
                 <w:szCs w:val="22"/>
               </w:rPr>
-              <w:t xml:space="preserve">Portfolio is filtered against SCCL Approved Securities List (ASL). Eligible schemes displayed with current NAV, unit balance, and applicable LTV. Ineligible schemes excluded at system level. Debt funds: </w:t>
-            </w:r>
-            <w:r>
-              <w:rPr>
-                <w:color w:val="333333"/>
-                <w:sz w:val="22"/>
-                <w:szCs w:val="22"/>
-              </w:rPr>
-              <w:t>8</w:t>
-            </w:r>
-            <w:r>
-              <w:rPr>
-                <w:color w:val="333333"/>
-                <w:sz w:val="22"/>
-                <w:szCs w:val="22"/>
-              </w:rPr>
-              <w:t xml:space="preserve">0% LTV. All other </w:t>
+              <w:t xml:space="preserve">Portfolio is filtered against SCCL Approved Securities List (ASL). Eligible schemes displayed with current NAV, unit balance, and applicable LTV. Ineligible schemes excluded at system level. Debt funds: 75%</w:t>
+            </w:r>
+            <w:r>
+              <w:rPr>
+                <w:color w:val="333333"/>
+                <w:sz w:val="22"/>
+                <w:szCs w:val="22"/>
+              </w:rPr>
+              <w:t/>
+            </w:r>
+            <w:r>
+              <w:rPr>
+                <w:color w:val="333333"/>
+                <w:sz w:val="22"/>
+                <w:szCs w:val="22"/>
+              </w:rPr>
+              <w:t xml:space="preserve"> LTV. All other </w:t>
             </w:r>
             <w:r>
               <w:rPr>
@@ -19471,31 +19471,31 @@
                 <w:sz w:val="22"/>
                 <w:szCs w:val="22"/>
               </w:rPr>
-              <w:t>Debt funds: 8</w:t>
-            </w:r>
-            <w:r>
-              <w:rPr>
-                <w:color w:val="333333"/>
-                <w:sz w:val="22"/>
-                <w:szCs w:val="22"/>
-              </w:rPr>
-              <w:t xml:space="preserve">0%. </w:t>
-            </w:r>
-            <w:r>
-              <w:rPr>
-                <w:color w:val="333333"/>
-                <w:sz w:val="22"/>
-                <w:szCs w:val="22"/>
-              </w:rPr>
-              <w:t>Equity fund: 70%. ELSS outside lock-in: 7</w:t>
-            </w:r>
-            <w:r>
-              <w:rPr>
-                <w:color w:val="333333"/>
-                <w:sz w:val="22"/>
-                <w:szCs w:val="22"/>
-              </w:rPr>
-              <w:t>0%. Configurable.</w:t>
+              <w:t>Debt funds: 75%</w:t>
+            </w:r>
+            <w:r>
+              <w:rPr>
+                <w:color w:val="333333"/>
+                <w:sz w:val="22"/>
+                <w:szCs w:val="22"/>
+              </w:rPr>
+              <w:t xml:space="preserve">. </w:t>
+            </w:r>
+            <w:r>
+              <w:rPr>
+                <w:color w:val="333333"/>
+                <w:sz w:val="22"/>
+                <w:szCs w:val="22"/>
+              </w:rPr>
+              <w:t>Equity fund: 70%. ELSS outside lock-in: 65%</w:t>
+            </w:r>
+            <w:r>
+              <w:rPr>
+                <w:color w:val="333333"/>
+                <w:sz w:val="22"/>
+                <w:szCs w:val="22"/>
+              </w:rPr>
+              <w:t>. Configurable.</w:t>
             </w:r>
           </w:p>
         </w:tc>
@@ -22241,15 +22241,15 @@
                 <w:sz w:val="22"/>
                 <w:szCs w:val="22"/>
               </w:rPr>
-              <w:t>aily post NAV refresh. Equity: 70% LTV. Debt: 8</w:t>
-            </w:r>
-            <w:r>
-              <w:rPr>
-                <w:color w:val="333333"/>
-                <w:sz w:val="22"/>
-                <w:szCs w:val="22"/>
-              </w:rPr>
-              <w:t>0% LTV.</w:t>
+              <w:t>aily post NAV refresh. Equity: 65% LTV. Debt: 75%</w:t>
+            </w:r>
+            <w:r>
+              <w:rPr>
+                <w:color w:val="333333"/>
+                <w:sz w:val="22"/>
+                <w:szCs w:val="22"/>
+              </w:rPr>
+              <w:t> LTV.</w:t>
             </w:r>
           </w:p>
         </w:tc>
@@ -26287,13 +26287,13 @@
         <w:rPr>
           <w:color w:val="333333"/>
         </w:rPr>
-        <w:t xml:space="preserve"> x applicable LTV. Equity: 70%. Debt: 8</w:t>
+        <w:t xml:space="preserve"> x applicable LTV. Equity: 65%. Debt: 75%</w:t>
       </w:r>
       <w:r>
         <w:rPr>
           <w:color w:val="333333"/>
         </w:rPr>
-        <w:t xml:space="preserve">0%. </w:t>
+        <w:t xml:space="preserve">. </w:t>
       </w:r>
       <w:r>
         <w:rPr>
@@ -26621,15 +26621,15 @@
                 <w:sz w:val="22"/>
                 <w:szCs w:val="22"/>
               </w:rPr>
-              <w:t>l lien-marked schemes. Equity: 70%. Debt: 8</w:t>
-            </w:r>
-            <w:r>
-              <w:rPr>
-                <w:color w:val="333333"/>
-                <w:sz w:val="22"/>
-                <w:szCs w:val="22"/>
-              </w:rPr>
-              <w:t>0%.</w:t>
+              <w:t>l lien-marked schemes. Equity: 65%. Debt: 75%</w:t>
+            </w:r>
+            <w:r>
+              <w:rPr>
+                <w:color w:val="333333"/>
+                <w:sz w:val="22"/>
+                <w:szCs w:val="22"/>
+              </w:rPr>
+              <w:t>.</w:t>
             </w:r>
           </w:p>
         </w:tc>
@@ -29196,7 +29196,7 @@
         <w:rPr>
           <w:color w:val="333333"/>
         </w:rPr>
-        <w:t xml:space="preserve"> per annum, this spread is determined by SCCL's internal cost of capital and is reviewed periodically. As dynamic pricing is activated, the spread is expected to widen for lower-quality or higher-risk borrower profiles.</w:t>
+        <w:t xml:space="preserve"> per annum, this spread is determined by SCCL's internal cost of capital and is reviewed periodically. Under risk-based pricing, the spread may vary for lower-quality or higher-risk borrower profiles.</w:t>
       </w:r>
     </w:p>
     <w:p>
@@ -29501,7 +29501,7 @@
                 <w:sz w:val="22"/>
                 <w:szCs w:val="22"/>
               </w:rPr>
-              <w:t xml:space="preserve"> 10 lakh sanctioned amount: Maximum 1% of Sanctioned Limit or 1500 whichever is higher</w:t>
+              <w:t xml:space="preserve"> 10 lakh sanctioned amount: Maximum 1% of Sanctioned Limit or Rs. 999 plus applicable GST, whichever is higher</w:t>
             </w:r>
           </w:p>
           <w:p>
@@ -31314,7 +31314,7 @@
                 <w:sz w:val="22"/>
                 <w:szCs w:val="22"/>
               </w:rPr>
-              <w:t xml:space="preserve"> 10 lakh sanctioned amount: Maximum 1% of Sanctioned Limit or 1500 whichever is higher</w:t>
+              <w:t xml:space="preserve"> 10 lakh sanctioned amount: Maximum 1% of Sanctioned Limit or Rs. 999 plus applicable GST, whichever is higher</w:t>
             </w:r>
           </w:p>
           <w:p>
@@ -37413,7 +37413,7 @@
                 <w:szCs w:val="22"/>
                 <w:lang w:val="en-US" w:eastAsia="en-US"/>
               </w:rPr>
-              <w:t>: 70% for equity, 8</w:t>
+              <w:t>: 65% for equity, 8</w:t>
             </w:r>
             <w:r>
               <w:rPr>
@@ -39994,7 +39994,7 @@
                 <w:sz w:val="22"/>
                 <w:szCs w:val="22"/>
               </w:rPr>
-              <w:t xml:space="preserve"> 10 lakh sanctioned amount: Maximum 1% of Sanctioned Limit or 1500 whichever is higher</w:t>
+              <w:t xml:space="preserve"> 10 lakh sanctioned amount: Maximum 1% of Sanctioned Limit or Rs. 999 plus applicable GST, whichever is higher</w:t>
             </w:r>
           </w:p>
           <w:p>
@@ -44837,7 +44837,7 @@
                 <w:sz w:val="22"/>
                 <w:szCs w:val="22"/>
               </w:rPr>
-              <w:t>collateral market value. SCCL: 70% equity, 8</w:t>
+              <w:t>collateral market value. SCCL: 65% equity, 8</w:t>
             </w:r>
             <w:r>
               <w:rPr>

</xml_diff>